<commit_message>
Word brand guide: navy starry page background + embedded visuals
Rebuild Manodrey-Guide-de-marque.docx in the full site look:
- Navy-blue starfield background on every page (a generated
  bg-navy-stars.png set as a full-page, behind-text header image —
  prints reliably and renders in Word + LibreOffice).
- Embedded the real brand visuals as images: the 3 wordmark versions
  (white/night, gold, reversed), the full lockup (cursive Manodrey +
  baseline + ✦), and the clear-space diagram.
- Light text, gold accents, ✦ bullets; colour-swatch, type and
  do/don't tables on dark surfaces — consistent with the site and the
  PDF.

Co-Authored-By: Claude Opus 4.8 (1M context) <noreply@anthropic.com>
</commit_message>
<xml_diff>
--- a/Manodrey-Guide-de-marque.docx
+++ b/Manodrey-Guide-de-marque.docx
@@ -1,7 +1,6 @@
 
 <file path=word/document.xml><?xml version="1.0" encoding="utf-8"?>
 <w:document xmlns:wpc="http://schemas.microsoft.com/office/word/2010/wordprocessingCanvas" xmlns:mo="http://schemas.microsoft.com/office/mac/office/2008/main" xmlns:mc="http://schemas.openxmlformats.org/markup-compatibility/2006" xmlns:mv="urn:schemas-microsoft-com:mac:vml" xmlns:o="urn:schemas-microsoft-com:office:office" xmlns:r="http://schemas.openxmlformats.org/officeDocument/2006/relationships" xmlns:m="http://schemas.openxmlformats.org/officeDocument/2006/math" xmlns:v="urn:schemas-microsoft-com:vml" xmlns:wp14="http://schemas.microsoft.com/office/word/2010/wordprocessingDrawing" xmlns:wp="http://schemas.openxmlformats.org/drawingml/2006/wordprocessingDrawing" xmlns:w10="urn:schemas-microsoft-com:office:word" xmlns:w="http://schemas.openxmlformats.org/wordprocessingml/2006/main" xmlns:w14="http://schemas.microsoft.com/office/word/2010/wordml" xmlns:wpg="http://schemas.microsoft.com/office/word/2010/wordprocessingGroup" xmlns:wpi="http://schemas.microsoft.com/office/word/2010/wordprocessingInk" xmlns:wne="http://schemas.microsoft.com/office/word/2006/wordml" xmlns:wps="http://schemas.microsoft.com/office/word/2010/wordprocessingShape" mc:Ignorable="w14 wp14">
-  <w:background w:color="01030A"/>
   <w:body>
     <w:p/>
     <w:p/>
@@ -19,7 +18,7 @@
           <w:b/>
           <w:i w:val="0"/>
           <w:caps/>
-          <w:color w:val="8C95B0"/>
+          <w:color w:val="9AA2BA"/>
           <w:sz w:val="20"/>
           <w:spacing w:val="80"/>
         </w:rPr>
@@ -28,7 +27,7 @@
     </w:p>
     <w:p>
       <w:pPr>
-        <w:spacing w:before="200"/>
+        <w:spacing w:before="160"/>
         <w:jc w:val="center"/>
       </w:pPr>
       <w:r>
@@ -407,7 +406,7 @@
           <w:rFonts w:ascii="Cambria" w:hAnsi="Cambria"/>
           <w:b w:val="0"/>
           <w:i/>
-          <w:color w:val="8C95B0"/>
+          <w:color w:val="9AA2BA"/>
           <w:sz w:val="24"/>
         </w:rPr>
         <w:t>La plateforme de marque est la colonne vertébrale de Manodrey : elle fixe pourquoi nous existons, où nous allons, ce que nous défendons et comment nous prenons la parole. Tout y converge vers une seule promesse — « Là où l'imaginaire prend vie ✦ » — et vers le parcours de Christian Bahfir, du ring du muay-thaï au plateau de tournage : la même discipline, désormais mise au service de la transmission par le récit.</w:t>
@@ -1315,13 +1314,13 @@
         </w:tblBorders>
       </w:tblPr>
       <w:tblGrid>
-        <w:gridCol w:w="4320"/>
-        <w:gridCol w:w="4320"/>
+        <w:gridCol w:w="4658"/>
+        <w:gridCol w:w="4658"/>
       </w:tblGrid>
       <w:tr>
         <w:tc>
           <w:tcPr>
-            <w:tcW w:type="dxa" w:w="4320"/>
+            <w:tcW w:type="dxa" w:w="4658"/>
             <w:shd w:val="clear" w:color="auto" w:fill="131D3F"/>
           </w:tcPr>
           <w:p>
@@ -1340,7 +1339,7 @@
         </w:tc>
         <w:tc>
           <w:tcPr>
-            <w:tcW w:type="dxa" w:w="4320"/>
+            <w:tcW w:type="dxa" w:w="4658"/>
             <w:shd w:val="clear" w:color="auto" w:fill="131D3F"/>
           </w:tcPr>
           <w:p>
@@ -1350,7 +1349,7 @@
                 <w:b/>
                 <w:i w:val="0"/>
                 <w:caps/>
-                <w:color w:val="8C95B0"/>
+                <w:color w:val="9AA2BA"/>
                 <w:sz w:val="20"/>
               </w:rPr>
               <w:t>À ÉVITER</w:t>
@@ -1361,7 +1360,7 @@
       <w:tr>
         <w:tc>
           <w:tcPr>
-            <w:tcW w:type="dxa" w:w="4320"/>
+            <w:tcW w:type="dxa" w:w="4658"/>
             <w:shd w:val="clear" w:color="auto" w:fill="0B1430"/>
           </w:tcPr>
           <w:p>
@@ -1517,7 +1516,7 @@
         </w:tc>
         <w:tc>
           <w:tcPr>
-            <w:tcW w:type="dxa" w:w="4320"/>
+            <w:tcW w:type="dxa" w:w="4658"/>
             <w:shd w:val="clear" w:color="auto" w:fill="0B1430"/>
           </w:tcPr>
           <w:p>
@@ -1529,7 +1528,7 @@
                 <w:rFonts w:ascii="Calibri" w:hAnsi="Calibri"/>
                 <w:b/>
                 <w:i w:val="0"/>
-                <w:color w:val="8C95B0"/>
+                <w:color w:val="9AA2BA"/>
                 <w:sz w:val="20"/>
               </w:rPr>
               <w:t xml:space="preserve">✕  </w:t>
@@ -1554,7 +1553,7 @@
                 <w:rFonts w:ascii="Calibri" w:hAnsi="Calibri"/>
                 <w:b/>
                 <w:i w:val="0"/>
-                <w:color w:val="8C95B0"/>
+                <w:color w:val="9AA2BA"/>
                 <w:sz w:val="20"/>
               </w:rPr>
               <w:t xml:space="preserve">✕  </w:t>
@@ -1579,7 +1578,7 @@
                 <w:rFonts w:ascii="Calibri" w:hAnsi="Calibri"/>
                 <w:b/>
                 <w:i w:val="0"/>
-                <w:color w:val="8C95B0"/>
+                <w:color w:val="9AA2BA"/>
                 <w:sz w:val="20"/>
               </w:rPr>
               <w:t xml:space="preserve">✕  </w:t>
@@ -1604,7 +1603,7 @@
                 <w:rFonts w:ascii="Calibri" w:hAnsi="Calibri"/>
                 <w:b/>
                 <w:i w:val="0"/>
-                <w:color w:val="8C95B0"/>
+                <w:color w:val="9AA2BA"/>
                 <w:sz w:val="20"/>
               </w:rPr>
               <w:t xml:space="preserve">✕  </w:t>
@@ -1629,7 +1628,7 @@
                 <w:rFonts w:ascii="Calibri" w:hAnsi="Calibri"/>
                 <w:b/>
                 <w:i w:val="0"/>
-                <w:color w:val="8C95B0"/>
+                <w:color w:val="9AA2BA"/>
                 <w:sz w:val="20"/>
               </w:rPr>
               <w:t xml:space="preserve">✕  </w:t>
@@ -1654,7 +1653,7 @@
                 <w:rFonts w:ascii="Calibri" w:hAnsi="Calibri"/>
                 <w:b/>
                 <w:i w:val="0"/>
-                <w:color w:val="8C95B0"/>
+                <w:color w:val="9AA2BA"/>
                 <w:sz w:val="20"/>
               </w:rPr>
               <w:t xml:space="preserve">✕  </w:t>
@@ -1726,7 +1725,7 @@
           <w:rFonts w:ascii="Cambria" w:hAnsi="Cambria"/>
           <w:b w:val="0"/>
           <w:i/>
-          <w:color w:val="8C95B0"/>
+          <w:color w:val="9AA2BA"/>
           <w:sz w:val="24"/>
         </w:rPr>
         <w:t>Le logo de Manodrey n'est pas un dessin : c'est une signature. Le mot-symbole « Manodrey », tracé à la main en cursive (police Allura), incarne une maison de production qui signe ses œuvres comme un auteur signe son film. Cette section fixe les règles qui garantissent que cette signature reste reconnaissable, élégante et cohérente, du grand écran au pied de page d'un e-mail.</w:t>
@@ -2328,6 +2327,174 @@
           <w:sz w:val="21"/>
         </w:rPr>
         <w:t>— Ne jamais composer la baseline en Allura ni en capitales : sa place est l'italique Cormorant. Et ne jamais transformer le « ✦ » en autre symbole (étoile à 5 branches, astérisque, puce).</w:t>
+      </w:r>
+    </w:p>
+    <w:p>
+      <w:pPr>
+        <w:spacing w:before="200" w:after="40"/>
+        <w:jc w:val="center"/>
+      </w:pPr>
+      <w:r>
+        <w:drawing>
+          <wp:inline xmlns:a="http://schemas.openxmlformats.org/drawingml/2006/main" xmlns:pic="http://schemas.openxmlformats.org/drawingml/2006/picture">
+            <wp:extent cx="5760720" cy="1231746"/>
+            <wp:docPr id="1" name="Picture 1"/>
+            <wp:cNvGraphicFramePr>
+              <a:graphicFrameLocks noChangeAspect="1"/>
+            </wp:cNvGraphicFramePr>
+            <a:graphic>
+              <a:graphicData uri="http://schemas.openxmlformats.org/drawingml/2006/picture">
+                <pic:pic>
+                  <pic:nvPicPr>
+                    <pic:cNvPr id="0" name="logo.png"/>
+                    <pic:cNvPicPr/>
+                  </pic:nvPicPr>
+                  <pic:blipFill>
+                    <a:blip r:embed="rId10"/>
+                    <a:stretch>
+                      <a:fillRect/>
+                    </a:stretch>
+                  </pic:blipFill>
+                  <pic:spPr>
+                    <a:xfrm>
+                      <a:off x="0" y="0"/>
+                      <a:ext cx="5760720" cy="1231746"/>
+                    </a:xfrm>
+                    <a:prstGeom prst="rect"/>
+                  </pic:spPr>
+                </pic:pic>
+              </a:graphicData>
+            </a:graphic>
+          </wp:inline>
+        </w:drawing>
+      </w:r>
+    </w:p>
+    <w:p>
+      <w:pPr>
+        <w:spacing w:after="160"/>
+        <w:jc w:val="center"/>
+      </w:pPr>
+      <w:r>
+        <w:rPr>
+          <w:rFonts w:ascii="Cambria" w:hAnsi="Cambria"/>
+          <w:b w:val="0"/>
+          <w:i/>
+          <w:color w:val="9AA2BA"/>
+          <w:sz w:val="18"/>
+        </w:rPr>
+        <w:t>Versions du mot-symbole</w:t>
+      </w:r>
+    </w:p>
+    <w:p>
+      <w:pPr>
+        <w:spacing w:before="200" w:after="40"/>
+        <w:jc w:val="center"/>
+      </w:pPr>
+      <w:r>
+        <w:drawing>
+          <wp:inline xmlns:a="http://schemas.openxmlformats.org/drawingml/2006/main" xmlns:pic="http://schemas.openxmlformats.org/drawingml/2006/picture">
+            <wp:extent cx="5760720" cy="1522476"/>
+            <wp:docPr id="2" name="Picture 2"/>
+            <wp:cNvGraphicFramePr>
+              <a:graphicFrameLocks noChangeAspect="1"/>
+            </wp:cNvGraphicFramePr>
+            <a:graphic>
+              <a:graphicData uri="http://schemas.openxmlformats.org/drawingml/2006/picture">
+                <pic:pic>
+                  <pic:nvPicPr>
+                    <pic:cNvPr id="0" name="lockup.png"/>
+                    <pic:cNvPicPr/>
+                  </pic:nvPicPr>
+                  <pic:blipFill>
+                    <a:blip r:embed="rId11"/>
+                    <a:stretch>
+                      <a:fillRect/>
+                    </a:stretch>
+                  </pic:blipFill>
+                  <pic:spPr>
+                    <a:xfrm>
+                      <a:off x="0" y="0"/>
+                      <a:ext cx="5760720" cy="1522476"/>
+                    </a:xfrm>
+                    <a:prstGeom prst="rect"/>
+                  </pic:spPr>
+                </pic:pic>
+              </a:graphicData>
+            </a:graphic>
+          </wp:inline>
+        </w:drawing>
+      </w:r>
+    </w:p>
+    <w:p>
+      <w:pPr>
+        <w:spacing w:after="160"/>
+        <w:jc w:val="center"/>
+      </w:pPr>
+      <w:r>
+        <w:rPr>
+          <w:rFonts w:ascii="Cambria" w:hAnsi="Cambria"/>
+          <w:b w:val="0"/>
+          <w:i/>
+          <w:color w:val="9AA2BA"/>
+          <w:sz w:val="18"/>
+        </w:rPr>
+        <w:t>Verrou complet</w:t>
+      </w:r>
+    </w:p>
+    <w:p>
+      <w:pPr>
+        <w:spacing w:before="200" w:after="40"/>
+        <w:jc w:val="center"/>
+      </w:pPr>
+      <w:r>
+        <w:drawing>
+          <wp:inline xmlns:a="http://schemas.openxmlformats.org/drawingml/2006/main" xmlns:pic="http://schemas.openxmlformats.org/drawingml/2006/picture">
+            <wp:extent cx="5760720" cy="931708"/>
+            <wp:docPr id="3" name="Picture 3"/>
+            <wp:cNvGraphicFramePr>
+              <a:graphicFrameLocks noChangeAspect="1"/>
+            </wp:cNvGraphicFramePr>
+            <a:graphic>
+              <a:graphicData uri="http://schemas.openxmlformats.org/drawingml/2006/picture">
+                <pic:pic>
+                  <pic:nvPicPr>
+                    <pic:cNvPr id="0" name="clearspace.png"/>
+                    <pic:cNvPicPr/>
+                  </pic:nvPicPr>
+                  <pic:blipFill>
+                    <a:blip r:embed="rId12"/>
+                    <a:stretch>
+                      <a:fillRect/>
+                    </a:stretch>
+                  </pic:blipFill>
+                  <pic:spPr>
+                    <a:xfrm>
+                      <a:off x="0" y="0"/>
+                      <a:ext cx="5760720" cy="931708"/>
+                    </a:xfrm>
+                    <a:prstGeom prst="rect"/>
+                  </pic:spPr>
+                </pic:pic>
+              </a:graphicData>
+            </a:graphic>
+          </wp:inline>
+        </w:drawing>
+      </w:r>
+    </w:p>
+    <w:p>
+      <w:pPr>
+        <w:spacing w:after="160"/>
+        <w:jc w:val="center"/>
+      </w:pPr>
+      <w:r>
+        <w:rPr>
+          <w:rFonts w:ascii="Cambria" w:hAnsi="Cambria"/>
+          <w:b w:val="0"/>
+          <w:i/>
+          <w:color w:val="9AA2BA"/>
+          <w:sz w:val="18"/>
+        </w:rPr>
+        <w:t>Zone de protection</w:t>
       </w:r>
     </w:p>
     <w:p/>
@@ -2346,13 +2513,13 @@
         </w:tblBorders>
       </w:tblPr>
       <w:tblGrid>
-        <w:gridCol w:w="4320"/>
-        <w:gridCol w:w="4320"/>
+        <w:gridCol w:w="4658"/>
+        <w:gridCol w:w="4658"/>
       </w:tblGrid>
       <w:tr>
         <w:tc>
           <w:tcPr>
-            <w:tcW w:type="dxa" w:w="4320"/>
+            <w:tcW w:type="dxa" w:w="4658"/>
             <w:shd w:val="clear" w:color="auto" w:fill="131D3F"/>
           </w:tcPr>
           <w:p>
@@ -2371,7 +2538,7 @@
         </w:tc>
         <w:tc>
           <w:tcPr>
-            <w:tcW w:type="dxa" w:w="4320"/>
+            <w:tcW w:type="dxa" w:w="4658"/>
             <w:shd w:val="clear" w:color="auto" w:fill="131D3F"/>
           </w:tcPr>
           <w:p>
@@ -2381,7 +2548,7 @@
                 <w:b/>
                 <w:i w:val="0"/>
                 <w:caps/>
-                <w:color w:val="8C95B0"/>
+                <w:color w:val="9AA2BA"/>
                 <w:sz w:val="20"/>
               </w:rPr>
               <w:t>À ÉVITER</w:t>
@@ -2392,7 +2559,7 @@
       <w:tr>
         <w:tc>
           <w:tcPr>
-            <w:tcW w:type="dxa" w:w="4320"/>
+            <w:tcW w:type="dxa" w:w="4658"/>
             <w:shd w:val="clear" w:color="auto" w:fill="0B1430"/>
           </w:tcPr>
           <w:p>
@@ -2573,7 +2740,7 @@
         </w:tc>
         <w:tc>
           <w:tcPr>
-            <w:tcW w:type="dxa" w:w="4320"/>
+            <w:tcW w:type="dxa" w:w="4658"/>
             <w:shd w:val="clear" w:color="auto" w:fill="0B1430"/>
           </w:tcPr>
           <w:p>
@@ -2585,7 +2752,7 @@
                 <w:rFonts w:ascii="Calibri" w:hAnsi="Calibri"/>
                 <w:b/>
                 <w:i w:val="0"/>
-                <w:color w:val="8C95B0"/>
+                <w:color w:val="9AA2BA"/>
                 <w:sz w:val="20"/>
               </w:rPr>
               <w:t xml:space="preserve">✕  </w:t>
@@ -2610,7 +2777,7 @@
                 <w:rFonts w:ascii="Calibri" w:hAnsi="Calibri"/>
                 <w:b/>
                 <w:i w:val="0"/>
-                <w:color w:val="8C95B0"/>
+                <w:color w:val="9AA2BA"/>
                 <w:sz w:val="20"/>
               </w:rPr>
               <w:t xml:space="preserve">✕  </w:t>
@@ -2635,7 +2802,7 @@
                 <w:rFonts w:ascii="Calibri" w:hAnsi="Calibri"/>
                 <w:b/>
                 <w:i w:val="0"/>
-                <w:color w:val="8C95B0"/>
+                <w:color w:val="9AA2BA"/>
                 <w:sz w:val="20"/>
               </w:rPr>
               <w:t xml:space="preserve">✕  </w:t>
@@ -2660,7 +2827,7 @@
                 <w:rFonts w:ascii="Calibri" w:hAnsi="Calibri"/>
                 <w:b/>
                 <w:i w:val="0"/>
-                <w:color w:val="8C95B0"/>
+                <w:color w:val="9AA2BA"/>
                 <w:sz w:val="20"/>
               </w:rPr>
               <w:t xml:space="preserve">✕  </w:t>
@@ -2685,7 +2852,7 @@
                 <w:rFonts w:ascii="Calibri" w:hAnsi="Calibri"/>
                 <w:b/>
                 <w:i w:val="0"/>
-                <w:color w:val="8C95B0"/>
+                <w:color w:val="9AA2BA"/>
                 <w:sz w:val="20"/>
               </w:rPr>
               <w:t xml:space="preserve">✕  </w:t>
@@ -2710,7 +2877,7 @@
                 <w:rFonts w:ascii="Calibri" w:hAnsi="Calibri"/>
                 <w:b/>
                 <w:i w:val="0"/>
-                <w:color w:val="8C95B0"/>
+                <w:color w:val="9AA2BA"/>
                 <w:sz w:val="20"/>
               </w:rPr>
               <w:t xml:space="preserve">✕  </w:t>
@@ -2735,7 +2902,7 @@
                 <w:rFonts w:ascii="Calibri" w:hAnsi="Calibri"/>
                 <w:b/>
                 <w:i w:val="0"/>
-                <w:color w:val="8C95B0"/>
+                <w:color w:val="9AA2BA"/>
                 <w:sz w:val="20"/>
               </w:rPr>
               <w:t xml:space="preserve">✕  </w:t>
@@ -2760,7 +2927,7 @@
                 <w:rFonts w:ascii="Calibri" w:hAnsi="Calibri"/>
                 <w:b/>
                 <w:i w:val="0"/>
-                <w:color w:val="8C95B0"/>
+                <w:color w:val="9AA2BA"/>
                 <w:sz w:val="20"/>
               </w:rPr>
               <w:t xml:space="preserve">✕  </w:t>
@@ -2832,7 +2999,7 @@
           <w:rFonts w:ascii="Cambria" w:hAnsi="Cambria"/>
           <w:b w:val="0"/>
           <w:i/>
-          <w:color w:val="8C95B0"/>
+          <w:color w:val="9AA2BA"/>
           <w:sz w:val="24"/>
         </w:rPr>
         <w:t>La couleur de Manodrey raconte une seule histoire : un ciel nocturne immense, profond et silencieux, dans lequel une lumière dorée scintille comme une étoile. Le noir-nuit porte tout ; l'or ne fait qu'apparaître. C'est un système volontairement frugal, où la rareté de la lumière fait sa préciosité.</w:t>
@@ -3929,9 +4096,9 @@
         </w:tblBorders>
       </w:tblPr>
       <w:tblGrid>
-        <w:gridCol w:w="2880"/>
-        <w:gridCol w:w="2880"/>
-        <w:gridCol w:w="2880"/>
+        <w:gridCol w:w="3106"/>
+        <w:gridCol w:w="3106"/>
+        <w:gridCol w:w="3106"/>
       </w:tblGrid>
       <w:tr>
         <w:tc>
@@ -3976,7 +4143,7 @@
                 <w:rFonts w:ascii="Consolas" w:hAnsi="Consolas"/>
                 <w:b w:val="0"/>
                 <w:i w:val="0"/>
-                <w:color w:val="8C95B0"/>
+                <w:color w:val="9AA2BA"/>
                 <w:sz w:val="18"/>
               </w:rPr>
               <w:t>#01030A</w:t>
@@ -4045,7 +4212,7 @@
                 <w:rFonts w:ascii="Consolas" w:hAnsi="Consolas"/>
                 <w:b w:val="0"/>
                 <w:i w:val="0"/>
-                <w:color w:val="8C95B0"/>
+                <w:color w:val="9AA2BA"/>
                 <w:sz w:val="18"/>
               </w:rPr>
               <w:t>#000000</w:t>
@@ -4066,7 +4233,7 @@
                 <w:color w:val="ECEDF3"/>
                 <w:sz w:val="19"/>
               </w:rPr>
-              <w:t>Ciel / vidéo plein cadre, vignettage</w:t>
+              <w:t>Ciel / vidéo plein cadre</w:t>
             </w:r>
           </w:p>
         </w:tc>
@@ -4114,7 +4281,7 @@
                 <w:rFonts w:ascii="Consolas" w:hAnsi="Consolas"/>
                 <w:b w:val="0"/>
                 <w:i w:val="0"/>
-                <w:color w:val="8C95B0"/>
+                <w:color w:val="9AA2BA"/>
                 <w:sz w:val="18"/>
               </w:rPr>
               <w:t>#D4AF7A</w:t>
@@ -4183,7 +4350,7 @@
                 <w:rFonts w:ascii="Consolas" w:hAnsi="Consolas"/>
                 <w:b w:val="0"/>
                 <w:i w:val="0"/>
-                <w:color w:val="8C95B0"/>
+                <w:color w:val="9AA2BA"/>
                 <w:sz w:val="18"/>
               </w:rPr>
               <w:t>#FFE9C4</w:t>
@@ -4252,7 +4419,7 @@
                 <w:rFonts w:ascii="Consolas" w:hAnsi="Consolas"/>
                 <w:b w:val="0"/>
                 <w:i w:val="0"/>
-                <w:color w:val="8C95B0"/>
+                <w:color w:val="9AA2BA"/>
                 <w:sz w:val="18"/>
               </w:rPr>
               <w:t>#A6824A</w:t>
@@ -4321,7 +4488,7 @@
                 <w:rFonts w:ascii="Consolas" w:hAnsi="Consolas"/>
                 <w:b w:val="0"/>
                 <w:i w:val="0"/>
-                <w:color w:val="8C95B0"/>
+                <w:color w:val="9AA2BA"/>
                 <w:sz w:val="18"/>
               </w:rPr>
               <w:t>#0B1430</w:t>
@@ -4390,7 +4557,7 @@
                 <w:rFonts w:ascii="Consolas" w:hAnsi="Consolas"/>
                 <w:b w:val="0"/>
                 <w:i w:val="0"/>
-                <w:color w:val="8C95B0"/>
+                <w:color w:val="9AA2BA"/>
                 <w:sz w:val="18"/>
               </w:rPr>
               <w:t>#131D3F</w:t>
@@ -4459,7 +4626,7 @@
                 <w:rFonts w:ascii="Consolas" w:hAnsi="Consolas"/>
                 <w:b w:val="0"/>
                 <w:i w:val="0"/>
-                <w:color w:val="8C95B0"/>
+                <w:color w:val="9AA2BA"/>
                 <w:sz w:val="18"/>
               </w:rPr>
               <w:t>#ECEDF3</w:t>
@@ -4480,7 +4647,7 @@
                 <w:color w:val="ECEDF3"/>
                 <w:sz w:val="19"/>
               </w:rPr>
-              <w:t>Texte principal (sur fond nuit)</w:t>
+              <w:t>Texte principal</w:t>
             </w:r>
           </w:p>
         </w:tc>
@@ -4528,7 +4695,7 @@
                 <w:rFonts w:ascii="Consolas" w:hAnsi="Consolas"/>
                 <w:b w:val="0"/>
                 <w:i w:val="0"/>
-                <w:color w:val="8C95B0"/>
+                <w:color w:val="9AA2BA"/>
                 <w:sz w:val="18"/>
               </w:rPr>
               <w:t>#8C95B0</w:t>
@@ -4597,7 +4764,7 @@
                 <w:rFonts w:ascii="Consolas" w:hAnsi="Consolas"/>
                 <w:b w:val="0"/>
                 <w:i w:val="0"/>
-                <w:color w:val="8C95B0"/>
+                <w:color w:val="9AA2BA"/>
                 <w:sz w:val="18"/>
               </w:rPr>
               <w:t>#4A5275</w:t>
@@ -4666,7 +4833,7 @@
                 <w:rFonts w:ascii="Consolas" w:hAnsi="Consolas"/>
                 <w:b w:val="0"/>
                 <w:i w:val="0"/>
-                <w:color w:val="8C95B0"/>
+                <w:color w:val="9AA2BA"/>
                 <w:sz w:val="18"/>
               </w:rPr>
               <w:t>#FFFFFF</w:t>
@@ -4687,7 +4854,7 @@
                 <w:color w:val="ECEDF3"/>
                 <w:sz w:val="19"/>
               </w:rPr>
-              <w:t>Mot-symbole, grands titres</w:t>
+              <w:t>Mot-symbole, titres</w:t>
             </w:r>
           </w:p>
         </w:tc>
@@ -4709,13 +4876,13 @@
         </w:tblBorders>
       </w:tblPr>
       <w:tblGrid>
-        <w:gridCol w:w="4320"/>
-        <w:gridCol w:w="4320"/>
+        <w:gridCol w:w="4658"/>
+        <w:gridCol w:w="4658"/>
       </w:tblGrid>
       <w:tr>
         <w:tc>
           <w:tcPr>
-            <w:tcW w:type="dxa" w:w="4320"/>
+            <w:tcW w:type="dxa" w:w="4658"/>
             <w:shd w:val="clear" w:color="auto" w:fill="131D3F"/>
           </w:tcPr>
           <w:p>
@@ -4734,7 +4901,7 @@
         </w:tc>
         <w:tc>
           <w:tcPr>
-            <w:tcW w:type="dxa" w:w="4320"/>
+            <w:tcW w:type="dxa" w:w="4658"/>
             <w:shd w:val="clear" w:color="auto" w:fill="131D3F"/>
           </w:tcPr>
           <w:p>
@@ -4744,7 +4911,7 @@
                 <w:b/>
                 <w:i w:val="0"/>
                 <w:caps/>
-                <w:color w:val="8C95B0"/>
+                <w:color w:val="9AA2BA"/>
                 <w:sz w:val="20"/>
               </w:rPr>
               <w:t>À ÉVITER</w:t>
@@ -4755,7 +4922,7 @@
       <w:tr>
         <w:tc>
           <w:tcPr>
-            <w:tcW w:type="dxa" w:w="4320"/>
+            <w:tcW w:type="dxa" w:w="4658"/>
             <w:shd w:val="clear" w:color="auto" w:fill="0B1430"/>
           </w:tcPr>
           <w:p>
@@ -4936,7 +5103,7 @@
         </w:tc>
         <w:tc>
           <w:tcPr>
-            <w:tcW w:type="dxa" w:w="4320"/>
+            <w:tcW w:type="dxa" w:w="4658"/>
             <w:shd w:val="clear" w:color="auto" w:fill="0B1430"/>
           </w:tcPr>
           <w:p>
@@ -4948,7 +5115,7 @@
                 <w:rFonts w:ascii="Calibri" w:hAnsi="Calibri"/>
                 <w:b/>
                 <w:i w:val="0"/>
-                <w:color w:val="8C95B0"/>
+                <w:color w:val="9AA2BA"/>
                 <w:sz w:val="20"/>
               </w:rPr>
               <w:t xml:space="preserve">✕  </w:t>
@@ -4973,7 +5140,7 @@
                 <w:rFonts w:ascii="Calibri" w:hAnsi="Calibri"/>
                 <w:b/>
                 <w:i w:val="0"/>
-                <w:color w:val="8C95B0"/>
+                <w:color w:val="9AA2BA"/>
                 <w:sz w:val="20"/>
               </w:rPr>
               <w:t xml:space="preserve">✕  </w:t>
@@ -4998,7 +5165,7 @@
                 <w:rFonts w:ascii="Calibri" w:hAnsi="Calibri"/>
                 <w:b/>
                 <w:i w:val="0"/>
-                <w:color w:val="8C95B0"/>
+                <w:color w:val="9AA2BA"/>
                 <w:sz w:val="20"/>
               </w:rPr>
               <w:t xml:space="preserve">✕  </w:t>
@@ -5023,7 +5190,7 @@
                 <w:rFonts w:ascii="Calibri" w:hAnsi="Calibri"/>
                 <w:b/>
                 <w:i w:val="0"/>
-                <w:color w:val="8C95B0"/>
+                <w:color w:val="9AA2BA"/>
                 <w:sz w:val="20"/>
               </w:rPr>
               <w:t xml:space="preserve">✕  </w:t>
@@ -5048,7 +5215,7 @@
                 <w:rFonts w:ascii="Calibri" w:hAnsi="Calibri"/>
                 <w:b/>
                 <w:i w:val="0"/>
-                <w:color w:val="8C95B0"/>
+                <w:color w:val="9AA2BA"/>
                 <w:sz w:val="20"/>
               </w:rPr>
               <w:t xml:space="preserve">✕  </w:t>
@@ -5073,7 +5240,7 @@
                 <w:rFonts w:ascii="Calibri" w:hAnsi="Calibri"/>
                 <w:b/>
                 <w:i w:val="0"/>
-                <w:color w:val="8C95B0"/>
+                <w:color w:val="9AA2BA"/>
                 <w:sz w:val="20"/>
               </w:rPr>
               <w:t xml:space="preserve">✕  </w:t>
@@ -5098,7 +5265,7 @@
                 <w:rFonts w:ascii="Calibri" w:hAnsi="Calibri"/>
                 <w:b/>
                 <w:i w:val="0"/>
-                <w:color w:val="8C95B0"/>
+                <w:color w:val="9AA2BA"/>
                 <w:sz w:val="20"/>
               </w:rPr>
               <w:t xml:space="preserve">✕  </w:t>
@@ -5170,7 +5337,7 @@
           <w:rFonts w:ascii="Cambria" w:hAnsi="Cambria"/>
           <w:b w:val="0"/>
           <w:i/>
-          <w:color w:val="8C95B0"/>
+          <w:color w:val="9AA2BA"/>
           <w:sz w:val="24"/>
         </w:rPr>
         <w:t>Quatre polices, quatre rôles, aucune exception. La typographie Manodrey met en scène un contraste entre le geste manuscrit (la signature), la noblesse cinématographique du titre Didone, l'élégance murmurée des accroches en italique et la clarté sobre de l'interface. Chaque police a une mission unique : c'est cette discipline qui crée l'impression « premium mais chaleureuse » de la marque.</w:t>
@@ -5803,9 +5970,9 @@
         </w:tblBorders>
       </w:tblPr>
       <w:tblGrid>
-        <w:gridCol w:w="2880"/>
-        <w:gridCol w:w="2880"/>
-        <w:gridCol w:w="2880"/>
+        <w:gridCol w:w="3106"/>
+        <w:gridCol w:w="3106"/>
+        <w:gridCol w:w="3106"/>
       </w:tblGrid>
       <w:tr>
         <w:tc>
@@ -5837,7 +6004,7 @@
                 <w:rFonts w:ascii="Calibri" w:hAnsi="Calibri"/>
                 <w:b w:val="0"/>
                 <w:i/>
-                <w:color w:val="8C95B0"/>
+                <w:color w:val="9AA2BA"/>
                 <w:sz w:val="19"/>
               </w:rPr>
               <w:t>Cursive manuscrite</w:t>
@@ -5858,7 +6025,7 @@
                 <w:color w:val="ECEDF3"/>
                 <w:sz w:val="19"/>
               </w:rPr>
-              <w:t>Le mot-symbole « Manodrey » uniquement — jamais un paragraphe.</w:t>
+              <w:t>Le mot-symbole « Manodrey » uniquement.</w:t>
             </w:r>
           </w:p>
         </w:tc>
@@ -5893,10 +6060,10 @@
                 <w:rFonts w:ascii="Calibri" w:hAnsi="Calibri"/>
                 <w:b w:val="0"/>
                 <w:i/>
-                <w:color w:val="8C95B0"/>
+                <w:color w:val="9AA2BA"/>
                 <w:sz w:val="19"/>
               </w:rPr>
-              <w:t>Serif Didone à fort contraste</w:t>
+              <w:t>Serif Didone</w:t>
             </w:r>
           </w:p>
         </w:tc>
@@ -5914,7 +6081,7 @@
                 <w:color w:val="ECEDF3"/>
                 <w:sz w:val="19"/>
               </w:rPr>
-              <w:t>Grands titres en CAPITALES (LA SALLE, CHRISTIAN BAHFIR).</w:t>
+              <w:t>Grands titres CAPITALES.</w:t>
             </w:r>
           </w:p>
         </w:tc>
@@ -5949,7 +6116,7 @@
                 <w:rFonts w:ascii="Calibri" w:hAnsi="Calibri"/>
                 <w:b w:val="0"/>
                 <w:i/>
-                <w:color w:val="8C95B0"/>
+                <w:color w:val="9AA2BA"/>
                 <w:sz w:val="19"/>
               </w:rPr>
               <w:t>Serif élégant</w:t>
@@ -5970,7 +6137,7 @@
                 <w:color w:val="ECEDF3"/>
                 <w:sz w:val="19"/>
               </w:rPr>
-              <w:t>Baseline et accroches poétiques (« Là où l’imaginaire prend vie »).</w:t>
+              <w:t>Baseline &amp; accroches poétiques.</w:t>
             </w:r>
           </w:p>
         </w:tc>
@@ -6005,7 +6172,7 @@
                 <w:rFonts w:ascii="Calibri" w:hAnsi="Calibri"/>
                 <w:b w:val="0"/>
                 <w:i/>
-                <w:color w:val="8C95B0"/>
+                <w:color w:val="9AA2BA"/>
                 <w:sz w:val="19"/>
               </w:rPr>
               <w:t>Sans-serif</w:t>
@@ -6026,7 +6193,7 @@
                 <w:color w:val="ECEDF3"/>
                 <w:sz w:val="19"/>
               </w:rPr>
-              <w:t>Interface, labels petites capitales espacées, corps, méta.</w:t>
+              <w:t>UI, labels, corps, méta.</w:t>
             </w:r>
           </w:p>
         </w:tc>
@@ -6048,13 +6215,13 @@
         </w:tblBorders>
       </w:tblPr>
       <w:tblGrid>
-        <w:gridCol w:w="4320"/>
-        <w:gridCol w:w="4320"/>
+        <w:gridCol w:w="4658"/>
+        <w:gridCol w:w="4658"/>
       </w:tblGrid>
       <w:tr>
         <w:tc>
           <w:tcPr>
-            <w:tcW w:type="dxa" w:w="4320"/>
+            <w:tcW w:type="dxa" w:w="4658"/>
             <w:shd w:val="clear" w:color="auto" w:fill="131D3F"/>
           </w:tcPr>
           <w:p>
@@ -6073,7 +6240,7 @@
         </w:tc>
         <w:tc>
           <w:tcPr>
-            <w:tcW w:type="dxa" w:w="4320"/>
+            <w:tcW w:type="dxa" w:w="4658"/>
             <w:shd w:val="clear" w:color="auto" w:fill="131D3F"/>
           </w:tcPr>
           <w:p>
@@ -6083,7 +6250,7 @@
                 <w:b/>
                 <w:i w:val="0"/>
                 <w:caps/>
-                <w:color w:val="8C95B0"/>
+                <w:color w:val="9AA2BA"/>
                 <w:sz w:val="20"/>
               </w:rPr>
               <w:t>À ÉVITER</w:t>
@@ -6094,7 +6261,7 @@
       <w:tr>
         <w:tc>
           <w:tcPr>
-            <w:tcW w:type="dxa" w:w="4320"/>
+            <w:tcW w:type="dxa" w:w="4658"/>
             <w:shd w:val="clear" w:color="auto" w:fill="0B1430"/>
           </w:tcPr>
           <w:p>
@@ -6275,7 +6442,7 @@
         </w:tc>
         <w:tc>
           <w:tcPr>
-            <w:tcW w:type="dxa" w:w="4320"/>
+            <w:tcW w:type="dxa" w:w="4658"/>
             <w:shd w:val="clear" w:color="auto" w:fill="0B1430"/>
           </w:tcPr>
           <w:p>
@@ -6287,7 +6454,7 @@
                 <w:rFonts w:ascii="Calibri" w:hAnsi="Calibri"/>
                 <w:b/>
                 <w:i w:val="0"/>
-                <w:color w:val="8C95B0"/>
+                <w:color w:val="9AA2BA"/>
                 <w:sz w:val="20"/>
               </w:rPr>
               <w:t xml:space="preserve">✕  </w:t>
@@ -6312,7 +6479,7 @@
                 <w:rFonts w:ascii="Calibri" w:hAnsi="Calibri"/>
                 <w:b/>
                 <w:i w:val="0"/>
-                <w:color w:val="8C95B0"/>
+                <w:color w:val="9AA2BA"/>
                 <w:sz w:val="20"/>
               </w:rPr>
               <w:t xml:space="preserve">✕  </w:t>
@@ -6337,7 +6504,7 @@
                 <w:rFonts w:ascii="Calibri" w:hAnsi="Calibri"/>
                 <w:b/>
                 <w:i w:val="0"/>
-                <w:color w:val="8C95B0"/>
+                <w:color w:val="9AA2BA"/>
                 <w:sz w:val="20"/>
               </w:rPr>
               <w:t xml:space="preserve">✕  </w:t>
@@ -6362,7 +6529,7 @@
                 <w:rFonts w:ascii="Calibri" w:hAnsi="Calibri"/>
                 <w:b/>
                 <w:i w:val="0"/>
-                <w:color w:val="8C95B0"/>
+                <w:color w:val="9AA2BA"/>
                 <w:sz w:val="20"/>
               </w:rPr>
               <w:t xml:space="preserve">✕  </w:t>
@@ -6387,7 +6554,7 @@
                 <w:rFonts w:ascii="Calibri" w:hAnsi="Calibri"/>
                 <w:b/>
                 <w:i w:val="0"/>
-                <w:color w:val="8C95B0"/>
+                <w:color w:val="9AA2BA"/>
                 <w:sz w:val="20"/>
               </w:rPr>
               <w:t xml:space="preserve">✕  </w:t>
@@ -6412,7 +6579,7 @@
                 <w:rFonts w:ascii="Calibri" w:hAnsi="Calibri"/>
                 <w:b/>
                 <w:i w:val="0"/>
-                <w:color w:val="8C95B0"/>
+                <w:color w:val="9AA2BA"/>
                 <w:sz w:val="20"/>
               </w:rPr>
               <w:t xml:space="preserve">✕  </w:t>
@@ -6437,7 +6604,7 @@
                 <w:rFonts w:ascii="Calibri" w:hAnsi="Calibri"/>
                 <w:b/>
                 <w:i w:val="0"/>
-                <w:color w:val="8C95B0"/>
+                <w:color w:val="9AA2BA"/>
                 <w:sz w:val="20"/>
               </w:rPr>
               <w:t xml:space="preserve">✕  </w:t>
@@ -6462,7 +6629,7 @@
                 <w:rFonts w:ascii="Calibri" w:hAnsi="Calibri"/>
                 <w:b/>
                 <w:i w:val="0"/>
-                <w:color w:val="8C95B0"/>
+                <w:color w:val="9AA2BA"/>
                 <w:sz w:val="20"/>
               </w:rPr>
               <w:t xml:space="preserve">✕  </w:t>
@@ -6534,7 +6701,7 @@
           <w:rFonts w:ascii="Cambria" w:hAnsi="Cambria"/>
           <w:b w:val="0"/>
           <w:i/>
-          <w:color w:val="8C95B0"/>
+          <w:color w:val="9AA2BA"/>
           <w:sz w:val="24"/>
         </w:rPr>
         <w:t>Trois motifs portent toute l'identité visuelle de Manodrey : l'étoile ✦ dorée (la signature), le ciel étoilé nocturne (le décor) et l'étoile filante (l'accent rare). Maîtrisés ensemble, ils créent l'univers onirique et cinématographique de la marque. Voici comment les employer, les espacer et les doser, avec leurs valeurs exactes.</w:t>
@@ -7269,6 +7436,62 @@
           <w:sz w:val="21"/>
         </w:rPr>
         <w:t>Les réveils animés — texte qui s'écrit (write-on), apparitions en fondu au scroll, scintillements — sont la manière dont ces motifs prennent vie. Ils restent lents, élégants et fluides, fidèles au ton onirique et cinématographique de Manodrey.</w:t>
+      </w:r>
+    </w:p>
+    <w:p>
+      <w:pPr>
+        <w:spacing w:before="200" w:after="40"/>
+        <w:jc w:val="center"/>
+      </w:pPr>
+      <w:r>
+        <w:drawing>
+          <wp:inline xmlns:a="http://schemas.openxmlformats.org/drawingml/2006/main" xmlns:pic="http://schemas.openxmlformats.org/drawingml/2006/picture">
+            <wp:extent cx="5760720" cy="1734094"/>
+            <wp:docPr id="4" name="Picture 4"/>
+            <wp:cNvGraphicFramePr>
+              <a:graphicFrameLocks noChangeAspect="1"/>
+            </wp:cNvGraphicFramePr>
+            <a:graphic>
+              <a:graphicData uri="http://schemas.openxmlformats.org/drawingml/2006/picture">
+                <pic:pic>
+                  <pic:nvPicPr>
+                    <pic:cNvPr id="0" name="motifs.png"/>
+                    <pic:cNvPicPr/>
+                  </pic:nvPicPr>
+                  <pic:blipFill>
+                    <a:blip r:embed="rId13"/>
+                    <a:stretch>
+                      <a:fillRect/>
+                    </a:stretch>
+                  </pic:blipFill>
+                  <pic:spPr>
+                    <a:xfrm>
+                      <a:off x="0" y="0"/>
+                      <a:ext cx="5760720" cy="1734094"/>
+                    </a:xfrm>
+                    <a:prstGeom prst="rect"/>
+                  </pic:spPr>
+                </pic:pic>
+              </a:graphicData>
+            </a:graphic>
+          </wp:inline>
+        </w:drawing>
+      </w:r>
+    </w:p>
+    <w:p>
+      <w:pPr>
+        <w:spacing w:after="160"/>
+        <w:jc w:val="center"/>
+      </w:pPr>
+      <w:r>
+        <w:rPr>
+          <w:rFonts w:ascii="Cambria" w:hAnsi="Cambria"/>
+          <w:b w:val="0"/>
+          <w:i/>
+          <w:color w:val="9AA2BA"/>
+          <w:sz w:val="18"/>
+        </w:rPr>
+        <w:t>L'étoile ✦ et ses usages</w:t>
       </w:r>
     </w:p>
     <w:p/>
@@ -7287,13 +7510,13 @@
         </w:tblBorders>
       </w:tblPr>
       <w:tblGrid>
-        <w:gridCol w:w="4320"/>
-        <w:gridCol w:w="4320"/>
+        <w:gridCol w:w="4658"/>
+        <w:gridCol w:w="4658"/>
       </w:tblGrid>
       <w:tr>
         <w:tc>
           <w:tcPr>
-            <w:tcW w:type="dxa" w:w="4320"/>
+            <w:tcW w:type="dxa" w:w="4658"/>
             <w:shd w:val="clear" w:color="auto" w:fill="131D3F"/>
           </w:tcPr>
           <w:p>
@@ -7312,7 +7535,7 @@
         </w:tc>
         <w:tc>
           <w:tcPr>
-            <w:tcW w:type="dxa" w:w="4320"/>
+            <w:tcW w:type="dxa" w:w="4658"/>
             <w:shd w:val="clear" w:color="auto" w:fill="131D3F"/>
           </w:tcPr>
           <w:p>
@@ -7322,7 +7545,7 @@
                 <w:b/>
                 <w:i w:val="0"/>
                 <w:caps/>
-                <w:color w:val="8C95B0"/>
+                <w:color w:val="9AA2BA"/>
                 <w:sz w:val="20"/>
               </w:rPr>
               <w:t>À ÉVITER</w:t>
@@ -7333,7 +7556,7 @@
       <w:tr>
         <w:tc>
           <w:tcPr>
-            <w:tcW w:type="dxa" w:w="4320"/>
+            <w:tcW w:type="dxa" w:w="4658"/>
             <w:shd w:val="clear" w:color="auto" w:fill="0B1430"/>
           </w:tcPr>
           <w:p>
@@ -7464,7 +7687,7 @@
         </w:tc>
         <w:tc>
           <w:tcPr>
-            <w:tcW w:type="dxa" w:w="4320"/>
+            <w:tcW w:type="dxa" w:w="4658"/>
             <w:shd w:val="clear" w:color="auto" w:fill="0B1430"/>
           </w:tcPr>
           <w:p>
@@ -7476,7 +7699,7 @@
                 <w:rFonts w:ascii="Calibri" w:hAnsi="Calibri"/>
                 <w:b/>
                 <w:i w:val="0"/>
-                <w:color w:val="8C95B0"/>
+                <w:color w:val="9AA2BA"/>
                 <w:sz w:val="20"/>
               </w:rPr>
               <w:t xml:space="preserve">✕  </w:t>
@@ -7501,7 +7724,7 @@
                 <w:rFonts w:ascii="Calibri" w:hAnsi="Calibri"/>
                 <w:b/>
                 <w:i w:val="0"/>
-                <w:color w:val="8C95B0"/>
+                <w:color w:val="9AA2BA"/>
                 <w:sz w:val="20"/>
               </w:rPr>
               <w:t xml:space="preserve">✕  </w:t>
@@ -7526,7 +7749,7 @@
                 <w:rFonts w:ascii="Calibri" w:hAnsi="Calibri"/>
                 <w:b/>
                 <w:i w:val="0"/>
-                <w:color w:val="8C95B0"/>
+                <w:color w:val="9AA2BA"/>
                 <w:sz w:val="20"/>
               </w:rPr>
               <w:t xml:space="preserve">✕  </w:t>
@@ -7551,7 +7774,7 @@
                 <w:rFonts w:ascii="Calibri" w:hAnsi="Calibri"/>
                 <w:b/>
                 <w:i w:val="0"/>
-                <w:color w:val="8C95B0"/>
+                <w:color w:val="9AA2BA"/>
                 <w:sz w:val="20"/>
               </w:rPr>
               <w:t xml:space="preserve">✕  </w:t>
@@ -7576,7 +7799,7 @@
                 <w:rFonts w:ascii="Calibri" w:hAnsi="Calibri"/>
                 <w:b/>
                 <w:i w:val="0"/>
-                <w:color w:val="8C95B0"/>
+                <w:color w:val="9AA2BA"/>
                 <w:sz w:val="20"/>
               </w:rPr>
               <w:t xml:space="preserve">✕  </w:t>
@@ -7648,7 +7871,7 @@
           <w:rFonts w:ascii="Cambria" w:hAnsi="Cambria"/>
           <w:b w:val="0"/>
           <w:i/>
-          <w:color w:val="8C95B0"/>
+          <w:color w:val="9AA2BA"/>
           <w:sz w:val="24"/>
         </w:rPr>
         <w:t>Le mouvement est la signature vivante de Manodrey : il fait littéralement « prendre vie à l'imaginaire ». Notre motion s'inspire du générique de cinéma — lent, fluide, élégant — et de la magie d'une signature qui s'écrit sous nos yeux. Jamais de clignotement agressif : ici, tout respire, scintille et se révèle.</w:t>
@@ -8426,13 +8649,13 @@
         </w:tblBorders>
       </w:tblPr>
       <w:tblGrid>
-        <w:gridCol w:w="4320"/>
-        <w:gridCol w:w="4320"/>
+        <w:gridCol w:w="4658"/>
+        <w:gridCol w:w="4658"/>
       </w:tblGrid>
       <w:tr>
         <w:tc>
           <w:tcPr>
-            <w:tcW w:type="dxa" w:w="4320"/>
+            <w:tcW w:type="dxa" w:w="4658"/>
             <w:shd w:val="clear" w:color="auto" w:fill="131D3F"/>
           </w:tcPr>
           <w:p>
@@ -8451,7 +8674,7 @@
         </w:tc>
         <w:tc>
           <w:tcPr>
-            <w:tcW w:type="dxa" w:w="4320"/>
+            <w:tcW w:type="dxa" w:w="4658"/>
             <w:shd w:val="clear" w:color="auto" w:fill="131D3F"/>
           </w:tcPr>
           <w:p>
@@ -8461,7 +8684,7 @@
                 <w:b/>
                 <w:i w:val="0"/>
                 <w:caps/>
-                <w:color w:val="8C95B0"/>
+                <w:color w:val="9AA2BA"/>
                 <w:sz w:val="20"/>
               </w:rPr>
               <w:t>À ÉVITER</w:t>
@@ -8472,7 +8695,7 @@
       <w:tr>
         <w:tc>
           <w:tcPr>
-            <w:tcW w:type="dxa" w:w="4320"/>
+            <w:tcW w:type="dxa" w:w="4658"/>
             <w:shd w:val="clear" w:color="auto" w:fill="0B1430"/>
           </w:tcPr>
           <w:p>
@@ -8653,7 +8876,7 @@
         </w:tc>
         <w:tc>
           <w:tcPr>
-            <w:tcW w:type="dxa" w:w="4320"/>
+            <w:tcW w:type="dxa" w:w="4658"/>
             <w:shd w:val="clear" w:color="auto" w:fill="0B1430"/>
           </w:tcPr>
           <w:p>
@@ -8665,7 +8888,7 @@
                 <w:rFonts w:ascii="Calibri" w:hAnsi="Calibri"/>
                 <w:b/>
                 <w:i w:val="0"/>
-                <w:color w:val="8C95B0"/>
+                <w:color w:val="9AA2BA"/>
                 <w:sz w:val="20"/>
               </w:rPr>
               <w:t xml:space="preserve">✕  </w:t>
@@ -8690,7 +8913,7 @@
                 <w:rFonts w:ascii="Calibri" w:hAnsi="Calibri"/>
                 <w:b/>
                 <w:i w:val="0"/>
-                <w:color w:val="8C95B0"/>
+                <w:color w:val="9AA2BA"/>
                 <w:sz w:val="20"/>
               </w:rPr>
               <w:t xml:space="preserve">✕  </w:t>
@@ -8715,7 +8938,7 @@
                 <w:rFonts w:ascii="Calibri" w:hAnsi="Calibri"/>
                 <w:b/>
                 <w:i w:val="0"/>
-                <w:color w:val="8C95B0"/>
+                <w:color w:val="9AA2BA"/>
                 <w:sz w:val="20"/>
               </w:rPr>
               <w:t xml:space="preserve">✕  </w:t>
@@ -8740,7 +8963,7 @@
                 <w:rFonts w:ascii="Calibri" w:hAnsi="Calibri"/>
                 <w:b/>
                 <w:i w:val="0"/>
-                <w:color w:val="8C95B0"/>
+                <w:color w:val="9AA2BA"/>
                 <w:sz w:val="20"/>
               </w:rPr>
               <w:t xml:space="preserve">✕  </w:t>
@@ -8765,7 +8988,7 @@
                 <w:rFonts w:ascii="Calibri" w:hAnsi="Calibri"/>
                 <w:b/>
                 <w:i w:val="0"/>
-                <w:color w:val="8C95B0"/>
+                <w:color w:val="9AA2BA"/>
                 <w:sz w:val="20"/>
               </w:rPr>
               <w:t xml:space="preserve">✕  </w:t>
@@ -8790,7 +9013,7 @@
                 <w:rFonts w:ascii="Calibri" w:hAnsi="Calibri"/>
                 <w:b/>
                 <w:i w:val="0"/>
-                <w:color w:val="8C95B0"/>
+                <w:color w:val="9AA2BA"/>
                 <w:sz w:val="20"/>
               </w:rPr>
               <w:t xml:space="preserve">✕  </w:t>
@@ -8815,7 +9038,7 @@
                 <w:rFonts w:ascii="Calibri" w:hAnsi="Calibri"/>
                 <w:b/>
                 <w:i w:val="0"/>
-                <w:color w:val="8C95B0"/>
+                <w:color w:val="9AA2BA"/>
                 <w:sz w:val="20"/>
               </w:rPr>
               <w:t xml:space="preserve">✕  </w:t>
@@ -8887,7 +9110,7 @@
           <w:rFonts w:ascii="Cambria" w:hAnsi="Cambria"/>
           <w:b w:val="0"/>
           <w:i/>
-          <w:color w:val="8C95B0"/>
+          <w:color w:val="9AA2BA"/>
           <w:sz w:val="24"/>
         </w:rPr>
         <w:t>La voix de Manodrey, c'est celle d'un conteur au coin du feu plus que d'un communicant. Poétique mais jamais précieuse, chaleureuse, optimiste, elle vouvoie toujours et croit au cinéma populaire de qualité — celui qui réunit, émeut et fait rêver large. Cette section fixe la personnalité verbale, le lexique de marque, et fournit des modèles prêts à l'emploi pour parler d'une seule et même voix partout.</w:t>
@@ -10288,13 +10511,13 @@
         </w:tblBorders>
       </w:tblPr>
       <w:tblGrid>
-        <w:gridCol w:w="4320"/>
-        <w:gridCol w:w="4320"/>
+        <w:gridCol w:w="4658"/>
+        <w:gridCol w:w="4658"/>
       </w:tblGrid>
       <w:tr>
         <w:tc>
           <w:tcPr>
-            <w:tcW w:type="dxa" w:w="4320"/>
+            <w:tcW w:type="dxa" w:w="4658"/>
             <w:shd w:val="clear" w:color="auto" w:fill="131D3F"/>
           </w:tcPr>
           <w:p>
@@ -10313,7 +10536,7 @@
         </w:tc>
         <w:tc>
           <w:tcPr>
-            <w:tcW w:type="dxa" w:w="4320"/>
+            <w:tcW w:type="dxa" w:w="4658"/>
             <w:shd w:val="clear" w:color="auto" w:fill="131D3F"/>
           </w:tcPr>
           <w:p>
@@ -10323,7 +10546,7 @@
                 <w:b/>
                 <w:i w:val="0"/>
                 <w:caps/>
-                <w:color w:val="8C95B0"/>
+                <w:color w:val="9AA2BA"/>
                 <w:sz w:val="20"/>
               </w:rPr>
               <w:t>À ÉVITER</w:t>
@@ -10334,7 +10557,7 @@
       <w:tr>
         <w:tc>
           <w:tcPr>
-            <w:tcW w:type="dxa" w:w="4320"/>
+            <w:tcW w:type="dxa" w:w="4658"/>
             <w:shd w:val="clear" w:color="auto" w:fill="0B1430"/>
           </w:tcPr>
           <w:p>
@@ -10490,7 +10713,7 @@
         </w:tc>
         <w:tc>
           <w:tcPr>
-            <w:tcW w:type="dxa" w:w="4320"/>
+            <w:tcW w:type="dxa" w:w="4658"/>
             <w:shd w:val="clear" w:color="auto" w:fill="0B1430"/>
           </w:tcPr>
           <w:p>
@@ -10502,7 +10725,7 @@
                 <w:rFonts w:ascii="Calibri" w:hAnsi="Calibri"/>
                 <w:b/>
                 <w:i w:val="0"/>
-                <w:color w:val="8C95B0"/>
+                <w:color w:val="9AA2BA"/>
                 <w:sz w:val="20"/>
               </w:rPr>
               <w:t xml:space="preserve">✕  </w:t>
@@ -10527,7 +10750,7 @@
                 <w:rFonts w:ascii="Calibri" w:hAnsi="Calibri"/>
                 <w:b/>
                 <w:i w:val="0"/>
-                <w:color w:val="8C95B0"/>
+                <w:color w:val="9AA2BA"/>
                 <w:sz w:val="20"/>
               </w:rPr>
               <w:t xml:space="preserve">✕  </w:t>
@@ -10552,7 +10775,7 @@
                 <w:rFonts w:ascii="Calibri" w:hAnsi="Calibri"/>
                 <w:b/>
                 <w:i w:val="0"/>
-                <w:color w:val="8C95B0"/>
+                <w:color w:val="9AA2BA"/>
                 <w:sz w:val="20"/>
               </w:rPr>
               <w:t xml:space="preserve">✕  </w:t>
@@ -10577,7 +10800,7 @@
                 <w:rFonts w:ascii="Calibri" w:hAnsi="Calibri"/>
                 <w:b/>
                 <w:i w:val="0"/>
-                <w:color w:val="8C95B0"/>
+                <w:color w:val="9AA2BA"/>
                 <w:sz w:val="20"/>
               </w:rPr>
               <w:t xml:space="preserve">✕  </w:t>
@@ -10602,7 +10825,7 @@
                 <w:rFonts w:ascii="Calibri" w:hAnsi="Calibri"/>
                 <w:b/>
                 <w:i w:val="0"/>
-                <w:color w:val="8C95B0"/>
+                <w:color w:val="9AA2BA"/>
                 <w:sz w:val="20"/>
               </w:rPr>
               <w:t xml:space="preserve">✕  </w:t>
@@ -10627,7 +10850,7 @@
                 <w:rFonts w:ascii="Calibri" w:hAnsi="Calibri"/>
                 <w:b/>
                 <w:i w:val="0"/>
-                <w:color w:val="8C95B0"/>
+                <w:color w:val="9AA2BA"/>
                 <w:sz w:val="20"/>
               </w:rPr>
               <w:t xml:space="preserve">✕  </w:t>
@@ -10699,7 +10922,7 @@
           <w:rFonts w:ascii="Cambria" w:hAnsi="Cambria"/>
           <w:b w:val="0"/>
           <w:i/>
-          <w:color w:val="8C95B0"/>
+          <w:color w:val="9AA2BA"/>
           <w:sz w:val="24"/>
         </w:rPr>
         <w:t>Ces déclinaisons traduisent l'univers Manodrey — ciel nocturne, signature manuscrite et étoile dorée — sur tous les supports physiques et numériques. Chaque application respecte les mêmes tokens (couleurs hex, polices, motif ✦) pour qu'une carte de visite, une bannière YouTube ou un carton de générique se reconnaissent au premier regard comme appartenant à la même maison de production.</w:t>
@@ -12266,6 +12489,62 @@
           <w:sz w:val="21"/>
         </w:rPr>
         <w:t>Bordures et filets : toujours discrets, équivalents print du rgba(255,255,255,0.07) du site — soit un gris/or très léger, jamais un trait noir franc.</w:t>
+      </w:r>
+    </w:p>
+    <w:p>
+      <w:pPr>
+        <w:spacing w:before="200" w:after="40"/>
+        <w:jc w:val="center"/>
+      </w:pPr>
+      <w:r>
+        <w:drawing>
+          <wp:inline xmlns:a="http://schemas.openxmlformats.org/drawingml/2006/main" xmlns:pic="http://schemas.openxmlformats.org/drawingml/2006/picture">
+            <wp:extent cx="4206240" cy="1488490"/>
+            <wp:docPr id="5" name="Picture 5"/>
+            <wp:cNvGraphicFramePr>
+              <a:graphicFrameLocks noChangeAspect="1"/>
+            </wp:cNvGraphicFramePr>
+            <a:graphic>
+              <a:graphicData uri="http://schemas.openxmlformats.org/drawingml/2006/picture">
+                <pic:pic>
+                  <pic:nvPicPr>
+                    <pic:cNvPr id="0" name="components.png"/>
+                    <pic:cNvPicPr/>
+                  </pic:nvPicPr>
+                  <pic:blipFill>
+                    <a:blip r:embed="rId14"/>
+                    <a:stretch>
+                      <a:fillRect/>
+                    </a:stretch>
+                  </pic:blipFill>
+                  <pic:spPr>
+                    <a:xfrm>
+                      <a:off x="0" y="0"/>
+                      <a:ext cx="4206240" cy="1488490"/>
+                    </a:xfrm>
+                    <a:prstGeom prst="rect"/>
+                  </pic:spPr>
+                </pic:pic>
+              </a:graphicData>
+            </a:graphic>
+          </wp:inline>
+        </w:drawing>
+      </w:r>
+    </w:p>
+    <w:p>
+      <w:pPr>
+        <w:spacing w:after="160"/>
+        <w:jc w:val="center"/>
+      </w:pPr>
+      <w:r>
+        <w:rPr>
+          <w:rFonts w:ascii="Cambria" w:hAnsi="Cambria"/>
+          <w:b w:val="0"/>
+          <w:i/>
+          <w:color w:val="9AA2BA"/>
+          <w:sz w:val="18"/>
+        </w:rPr>
+        <w:t>Composants — tels qu’à l’écran</w:t>
       </w:r>
     </w:p>
     <w:p/>
@@ -12284,13 +12563,13 @@
         </w:tblBorders>
       </w:tblPr>
       <w:tblGrid>
-        <w:gridCol w:w="4320"/>
-        <w:gridCol w:w="4320"/>
+        <w:gridCol w:w="4658"/>
+        <w:gridCol w:w="4658"/>
       </w:tblGrid>
       <w:tr>
         <w:tc>
           <w:tcPr>
-            <w:tcW w:type="dxa" w:w="4320"/>
+            <w:tcW w:type="dxa" w:w="4658"/>
             <w:shd w:val="clear" w:color="auto" w:fill="131D3F"/>
           </w:tcPr>
           <w:p>
@@ -12309,7 +12588,7 @@
         </w:tc>
         <w:tc>
           <w:tcPr>
-            <w:tcW w:type="dxa" w:w="4320"/>
+            <w:tcW w:type="dxa" w:w="4658"/>
             <w:shd w:val="clear" w:color="auto" w:fill="131D3F"/>
           </w:tcPr>
           <w:p>
@@ -12319,7 +12598,7 @@
                 <w:b/>
                 <w:i w:val="0"/>
                 <w:caps/>
-                <w:color w:val="8C95B0"/>
+                <w:color w:val="9AA2BA"/>
                 <w:sz w:val="20"/>
               </w:rPr>
               <w:t>À ÉVITER</w:t>
@@ -12330,7 +12609,7 @@
       <w:tr>
         <w:tc>
           <w:tcPr>
-            <w:tcW w:type="dxa" w:w="4320"/>
+            <w:tcW w:type="dxa" w:w="4658"/>
             <w:shd w:val="clear" w:color="auto" w:fill="0B1430"/>
           </w:tcPr>
           <w:p>
@@ -12511,7 +12790,7 @@
         </w:tc>
         <w:tc>
           <w:tcPr>
-            <w:tcW w:type="dxa" w:w="4320"/>
+            <w:tcW w:type="dxa" w:w="4658"/>
             <w:shd w:val="clear" w:color="auto" w:fill="0B1430"/>
           </w:tcPr>
           <w:p>
@@ -12523,7 +12802,7 @@
                 <w:rFonts w:ascii="Calibri" w:hAnsi="Calibri"/>
                 <w:b/>
                 <w:i w:val="0"/>
-                <w:color w:val="8C95B0"/>
+                <w:color w:val="9AA2BA"/>
                 <w:sz w:val="20"/>
               </w:rPr>
               <w:t xml:space="preserve">✕  </w:t>
@@ -12548,7 +12827,7 @@
                 <w:rFonts w:ascii="Calibri" w:hAnsi="Calibri"/>
                 <w:b/>
                 <w:i w:val="0"/>
-                <w:color w:val="8C95B0"/>
+                <w:color w:val="9AA2BA"/>
                 <w:sz w:val="20"/>
               </w:rPr>
               <w:t xml:space="preserve">✕  </w:t>
@@ -12573,7 +12852,7 @@
                 <w:rFonts w:ascii="Calibri" w:hAnsi="Calibri"/>
                 <w:b/>
                 <w:i w:val="0"/>
-                <w:color w:val="8C95B0"/>
+                <w:color w:val="9AA2BA"/>
                 <w:sz w:val="20"/>
               </w:rPr>
               <w:t xml:space="preserve">✕  </w:t>
@@ -12598,7 +12877,7 @@
                 <w:rFonts w:ascii="Calibri" w:hAnsi="Calibri"/>
                 <w:b/>
                 <w:i w:val="0"/>
-                <w:color w:val="8C95B0"/>
+                <w:color w:val="9AA2BA"/>
                 <w:sz w:val="20"/>
               </w:rPr>
               <w:t xml:space="preserve">✕  </w:t>
@@ -12623,7 +12902,7 @@
                 <w:rFonts w:ascii="Calibri" w:hAnsi="Calibri"/>
                 <w:b/>
                 <w:i w:val="0"/>
-                <w:color w:val="8C95B0"/>
+                <w:color w:val="9AA2BA"/>
                 <w:sz w:val="20"/>
               </w:rPr>
               <w:t xml:space="preserve">✕  </w:t>
@@ -12648,7 +12927,7 @@
                 <w:rFonts w:ascii="Calibri" w:hAnsi="Calibri"/>
                 <w:b/>
                 <w:i w:val="0"/>
-                <w:color w:val="8C95B0"/>
+                <w:color w:val="9AA2BA"/>
                 <w:sz w:val="20"/>
               </w:rPr>
               <w:t xml:space="preserve">✕  </w:t>
@@ -12673,7 +12952,7 @@
                 <w:rFonts w:ascii="Calibri" w:hAnsi="Calibri"/>
                 <w:b/>
                 <w:i w:val="0"/>
-                <w:color w:val="8C95B0"/>
+                <w:color w:val="9AA2BA"/>
                 <w:sz w:val="20"/>
               </w:rPr>
               <w:t xml:space="preserve">✕  </w:t>
@@ -12746,7 +13025,7 @@
           <w:b w:val="0"/>
           <w:i w:val="0"/>
           <w:caps/>
-          <w:color w:val="8C95B0"/>
+          <w:color w:val="9AA2BA"/>
           <w:sz w:val="18"/>
           <w:spacing w:val="30"/>
         </w:rPr>
@@ -12762,20 +13041,73 @@
           <w:rFonts w:ascii="Calibri" w:hAnsi="Calibri"/>
           <w:b w:val="0"/>
           <w:i w:val="0"/>
-          <w:color w:val="8C95B0"/>
+          <w:color w:val="9AA2BA"/>
           <w:sz w:val="18"/>
         </w:rPr>
         <w:t>Instagram @lasallelaserie · TikTok @manodreytv93 · YouTube @manodreytv</w:t>
       </w:r>
     </w:p>
     <w:sectPr>
-      <w:pgSz w:w="12240" w:h="15840"/>
-      <w:pgMar w:top="1440" w:right="1800" w:bottom="1440" w:left="1800" w:header="720" w:footer="720" w:gutter="0"/>
+      <w:headerReference w:type="default" r:id="rId9"/>
+      <w:pgSz w:w="11909" w:h="16834"/>
+      <w:pgMar w:top="1296" w:right="1296" w:bottom="1296" w:left="1296" w:header="720" w:footer="720" w:gutter="0"/>
       <w:cols w:space="720"/>
       <w:docGrid w:linePitch="360"/>
     </w:sectPr>
   </w:body>
 </w:document>
+</file>
+
+<file path=word/header1.xml><?xml version="1.0" encoding="utf-8"?>
+<w:hdr xmlns:m="http://schemas.openxmlformats.org/officeDocument/2006/math" xmlns:mc="http://schemas.openxmlformats.org/markup-compatibility/2006" xmlns:mo="http://schemas.microsoft.com/office/mac/office/2008/main" xmlns:mv="urn:schemas-microsoft-com:mac:vml" xmlns:o="urn:schemas-microsoft-com:office:office" xmlns:r="http://schemas.openxmlformats.org/officeDocument/2006/relationships" xmlns:v="urn:schemas-microsoft-com:vml" xmlns:w10="urn:schemas-microsoft-com:office:word" xmlns:w14="http://schemas.microsoft.com/office/word/2010/wordml" xmlns:w="http://schemas.openxmlformats.org/wordprocessingml/2006/main" xmlns:wne="http://schemas.microsoft.com/office/word/2006/wordml" xmlns:wp14="http://schemas.microsoft.com/office/word/2010/wordprocessingDrawing" xmlns:wp="http://schemas.openxmlformats.org/drawingml/2006/wordprocessingDrawing" xmlns:wpc="http://schemas.microsoft.com/office/word/2010/wordprocessingCanvas" xmlns:wpg="http://schemas.microsoft.com/office/word/2010/wordprocessingGroup" xmlns:wpi="http://schemas.microsoft.com/office/word/2010/wordprocessingInk" xmlns:wps="http://schemas.microsoft.com/office/word/2010/wordprocessingShape" mc:Ignorable="w14 wp14">
+  <w:p>
+    <w:pPr>
+      <w:pStyle w:val="Header"/>
+      <w:jc w:val="left"/>
+    </w:pPr>
+    <w:r>
+      <w:drawing>
+        <wp:anchor xmlns:a="http://schemas.openxmlformats.org/drawingml/2006/main" behindDoc="1" distT="0" distB="0" distL="0" distR="0" simplePos="0" locked="0" layoutInCell="1" allowOverlap="1" relativeHeight="0">
+          <wp:simplePos x="0" y="0"/>
+          <wp:positionH relativeFrom="page">
+            <wp:posOffset>0</wp:posOffset>
+          </wp:positionH>
+          <wp:positionV relativeFrom="page">
+            <wp:posOffset>0</wp:posOffset>
+          </wp:positionV>
+          <wp:extent cx="7562215" cy="10689590"/>
+          <wp:effectExtent l="0" t="0" r="0" b="0"/>
+          <wp:wrapNone/>
+          <wp:docPr id="1" name="Picture 1"/>
+          <wp:cNvGraphicFramePr/>
+          <a:graphic xmlns:pic="http://schemas.openxmlformats.org/drawingml/2006/picture">
+            <a:graphicData uri="http://schemas.openxmlformats.org/drawingml/2006/picture">
+              <pic:pic>
+                <pic:nvPicPr>
+                  <pic:cNvPr id="0" name="bg-navy-stars.png"/>
+                  <pic:cNvPicPr/>
+                </pic:nvPicPr>
+                <pic:blipFill>
+                  <a:blip r:embed="rId1"/>
+                  <a:stretch>
+                    <a:fillRect/>
+                  </a:stretch>
+                </pic:blipFill>
+                <pic:spPr>
+                  <a:xfrm>
+                    <a:off x="0" y="0"/>
+                    <a:ext cx="7562215" cy="10689590"/>
+                  </a:xfrm>
+                  <a:prstGeom prst="rect"/>
+                </pic:spPr>
+              </pic:pic>
+            </a:graphicData>
+          </a:graphic>
+        </wp:anchor>
+      </w:drawing>
+    </w:r>
+  </w:p>
+</w:hdr>
 </file>
 
 <file path=word/numbering.xml><?xml version="1.0" encoding="utf-8"?>
@@ -13142,7 +13474,7 @@
     <w:qFormat/>
     <w:rsid w:val="00FC693F"/>
     <w:pPr>
-      <w:spacing w:after="120" w:line="307" w:lineRule="auto"/>
+      <w:spacing w:after="120" w:line="312" w:lineRule="auto"/>
     </w:pPr>
     <w:rPr>
       <w:rFonts w:ascii="Calibri" w:hAnsi="Calibri"/>

</xml_diff>